<commit_message>
change: Added week 5
</commit_message>
<xml_diff>
--- a/Meeting Reports/Meeting Report- Week 4.docx
+++ b/Meeting Reports/Meeting Report- Week 4.docx
@@ -900,50 +900,58 @@
           <w:sz w:val="22"/>
           <w:lang w:val="en-DE"/>
         </w:rPr>
-        <w:t>Designing activity diagram for each use case table created during last week</w:t>
-      </w:r>
-    </w:p>
-    <w:p>
-      <w:pPr>
-        <w:rPr>
-          <w:rFonts w:ascii="Arial" w:hAnsi="Arial"/>
-          <w:sz w:val="22"/>
-          <w:lang w:val="en-DE"/>
-        </w:rPr>
-      </w:pPr>
-    </w:p>
-    <w:p>
-      <w:pPr>
-        <w:rPr>
-          <w:rFonts w:ascii="Arial" w:hAnsi="Arial"/>
-          <w:sz w:val="22"/>
-          <w:lang w:val="en-DE"/>
-        </w:rPr>
-      </w:pPr>
-      <w:r>
-        <w:rPr>
-          <w:rFonts w:ascii="Arial" w:hAnsi="Arial"/>
-          <w:b/>
-          <w:sz w:val="22"/>
-          <w:lang w:val="en-DE"/>
-        </w:rPr>
-        <w:t>3)</w:t>
-      </w:r>
-      <w:r>
-        <w:rPr>
-          <w:rFonts w:ascii="Arial" w:hAnsi="Arial"/>
-          <w:sz w:val="22"/>
-          <w:lang w:val="en-DE"/>
-        </w:rPr>
-        <w:t>Creating the state diagrams</w:t>
-      </w:r>
-    </w:p>
-    <w:p>
-      <w:pPr>
-        <w:rPr>
-          <w:rFonts w:ascii="Arial" w:hAnsi="Arial"/>
-          <w:b/>
-          <w:sz w:val="22"/>
+        <w:t>Designing activity</w:t>
+      </w:r>
+      <w:r>
+        <w:rPr>
+          <w:rFonts w:ascii="Arial" w:hAnsi="Arial"/>
+          <w:sz w:val="22"/>
+          <w:lang w:val="en-DE"/>
+        </w:rPr>
+        <w:t>/</w:t>
+      </w:r>
+      <w:proofErr w:type="spellStart"/>
+      <w:r>
+        <w:rPr>
+          <w:rFonts w:ascii="Arial" w:hAnsi="Arial"/>
+          <w:sz w:val="22"/>
+          <w:lang w:val="en-DE"/>
+        </w:rPr>
+        <w:t>swimlane</w:t>
+      </w:r>
+      <w:proofErr w:type="spellEnd"/>
+      <w:r>
+        <w:rPr>
+          <w:rFonts w:ascii="Arial" w:hAnsi="Arial"/>
+          <w:sz w:val="22"/>
+          <w:lang w:val="en-DE"/>
+        </w:rPr>
+        <w:t xml:space="preserve"> diagram</w:t>
+      </w:r>
+      <w:r>
+        <w:rPr>
+          <w:rFonts w:ascii="Arial" w:hAnsi="Arial"/>
+          <w:sz w:val="22"/>
+          <w:lang w:val="en-DE"/>
+        </w:rPr>
+        <w:t xml:space="preserve"> for each use case table created during last week</w:t>
+      </w:r>
+      <w:r>
+        <w:rPr>
+          <w:rFonts w:ascii="Arial" w:hAnsi="Arial"/>
+          <w:sz w:val="22"/>
+          <w:lang w:val="en-DE"/>
+        </w:rPr>
+        <w:t>.</w:t>
+      </w:r>
+    </w:p>
+    <w:p>
+      <w:pPr>
+        <w:rPr>
+          <w:rFonts w:ascii="Arial" w:hAnsi="Arial"/>
+          <w:b/>
+          <w:sz w:val="22"/>
+          <w:lang w:val="en-DE"/>
         </w:rPr>
       </w:pPr>
     </w:p>
@@ -1018,88 +1026,184 @@
           <w:sz w:val="22"/>
           <w:lang w:val="en-DE"/>
         </w:rPr>
-        <w:t xml:space="preserve"> we came to the conclusion that after making the improvements suggested by the lecturer during the seminar we would then continue to proceed with designing the activity diagram for each use case table that we created last week and also creating and designing the state diagrams.</w:t>
-      </w:r>
-    </w:p>
-    <w:p>
-      <w:pPr>
-        <w:rPr>
-          <w:rFonts w:ascii="Arial" w:hAnsi="Arial"/>
-          <w:b/>
-          <w:sz w:val="22"/>
-          <w:u w:val="single"/>
-        </w:rPr>
-      </w:pPr>
-    </w:p>
-    <w:p>
-      <w:pPr>
-        <w:rPr>
-          <w:rFonts w:ascii="Arial" w:hAnsi="Arial"/>
-          <w:b/>
-          <w:sz w:val="22"/>
-          <w:u w:val="single"/>
-        </w:rPr>
-      </w:pPr>
-    </w:p>
-    <w:p>
-      <w:pPr>
-        <w:rPr>
-          <w:rFonts w:ascii="Arial" w:hAnsi="Arial"/>
-          <w:b/>
-          <w:sz w:val="22"/>
-          <w:u w:val="single"/>
-        </w:rPr>
-      </w:pPr>
-    </w:p>
-    <w:p>
-      <w:pPr>
-        <w:rPr>
-          <w:rFonts w:ascii="Arial" w:hAnsi="Arial"/>
-          <w:b/>
-          <w:sz w:val="22"/>
-          <w:u w:val="single"/>
-        </w:rPr>
-      </w:pPr>
-    </w:p>
-    <w:p>
-      <w:pPr>
-        <w:rPr>
-          <w:rFonts w:ascii="Arial" w:hAnsi="Arial"/>
-          <w:b/>
-          <w:sz w:val="22"/>
-          <w:u w:val="single"/>
-        </w:rPr>
-      </w:pPr>
-    </w:p>
-    <w:p>
-      <w:pPr>
-        <w:rPr>
-          <w:rFonts w:ascii="Arial" w:hAnsi="Arial"/>
-          <w:b/>
-          <w:sz w:val="22"/>
-          <w:u w:val="single"/>
-        </w:rPr>
-      </w:pPr>
-    </w:p>
-    <w:p>
-      <w:pPr>
-        <w:rPr>
-          <w:rFonts w:ascii="Arial" w:hAnsi="Arial"/>
-          <w:b/>
-          <w:sz w:val="22"/>
-          <w:u w:val="single"/>
-        </w:rPr>
-      </w:pPr>
-    </w:p>
-    <w:p>
-      <w:pPr>
-        <w:rPr>
-          <w:rFonts w:ascii="Arial" w:hAnsi="Arial"/>
-          <w:b/>
-          <w:sz w:val="22"/>
-          <w:u w:val="single"/>
-        </w:rPr>
-      </w:pPr>
+        <w:t xml:space="preserve"> we came to the conclusion that after making the improvements suggested by the lecturer during the seminar we would then continue to proceed with designing the activity diagram</w:t>
+      </w:r>
+      <w:r>
+        <w:rPr>
+          <w:rFonts w:ascii="Arial" w:hAnsi="Arial"/>
+          <w:sz w:val="22"/>
+          <w:lang w:val="en-DE"/>
+        </w:rPr>
+        <w:t>/</w:t>
+      </w:r>
+      <w:proofErr w:type="spellStart"/>
+      <w:r>
+        <w:rPr>
+          <w:rFonts w:ascii="Arial" w:hAnsi="Arial"/>
+          <w:sz w:val="22"/>
+          <w:lang w:val="en-DE"/>
+        </w:rPr>
+        <w:t>swimlane</w:t>
+      </w:r>
+      <w:proofErr w:type="spellEnd"/>
+      <w:r>
+        <w:rPr>
+          <w:rFonts w:ascii="Arial" w:hAnsi="Arial"/>
+          <w:sz w:val="22"/>
+          <w:lang w:val="en-DE"/>
+        </w:rPr>
+        <w:t xml:space="preserve"> diagram</w:t>
+      </w:r>
+      <w:r>
+        <w:rPr>
+          <w:rFonts w:ascii="Arial" w:hAnsi="Arial"/>
+          <w:sz w:val="22"/>
+          <w:lang w:val="en-DE"/>
+        </w:rPr>
+        <w:t xml:space="preserve"> </w:t>
+      </w:r>
+      <w:r>
+        <w:rPr>
+          <w:rFonts w:ascii="Arial" w:hAnsi="Arial"/>
+          <w:sz w:val="22"/>
+          <w:lang w:val="en-DE"/>
+        </w:rPr>
+        <w:t>according to the</w:t>
+      </w:r>
+      <w:r>
+        <w:rPr>
+          <w:rFonts w:ascii="Arial" w:hAnsi="Arial"/>
+          <w:sz w:val="22"/>
+          <w:lang w:val="en-DE"/>
+        </w:rPr>
+        <w:t xml:space="preserve"> use case table</w:t>
+      </w:r>
+      <w:r>
+        <w:rPr>
+          <w:rFonts w:ascii="Arial" w:hAnsi="Arial"/>
+          <w:sz w:val="22"/>
+          <w:lang w:val="en-DE"/>
+        </w:rPr>
+        <w:t>s</w:t>
+      </w:r>
+      <w:r>
+        <w:rPr>
+          <w:rFonts w:ascii="Arial" w:hAnsi="Arial"/>
+          <w:sz w:val="22"/>
+          <w:lang w:val="en-DE"/>
+        </w:rPr>
+        <w:t xml:space="preserve"> that we created last week</w:t>
+      </w:r>
+      <w:r>
+        <w:rPr>
+          <w:rFonts w:ascii="Arial" w:hAnsi="Arial"/>
+          <w:sz w:val="22"/>
+          <w:lang w:val="en-DE"/>
+        </w:rPr>
+        <w:t>.</w:t>
+      </w:r>
+    </w:p>
+    <w:p>
+      <w:pPr>
+        <w:rPr>
+          <w:rFonts w:ascii="Arial" w:hAnsi="Arial"/>
+          <w:b/>
+          <w:sz w:val="22"/>
+          <w:u w:val="single"/>
+        </w:rPr>
+      </w:pPr>
+    </w:p>
+    <w:p>
+      <w:pPr>
+        <w:rPr>
+          <w:rFonts w:ascii="Arial" w:hAnsi="Arial"/>
+          <w:b/>
+          <w:sz w:val="22"/>
+          <w:u w:val="single"/>
+        </w:rPr>
+      </w:pPr>
+    </w:p>
+    <w:p>
+      <w:pPr>
+        <w:rPr>
+          <w:rFonts w:ascii="Arial" w:hAnsi="Arial"/>
+          <w:b/>
+          <w:sz w:val="22"/>
+          <w:u w:val="single"/>
+        </w:rPr>
+      </w:pPr>
+    </w:p>
+    <w:p>
+      <w:pPr>
+        <w:rPr>
+          <w:rFonts w:ascii="Arial" w:hAnsi="Arial"/>
+          <w:b/>
+          <w:sz w:val="22"/>
+          <w:u w:val="single"/>
+        </w:rPr>
+      </w:pPr>
+    </w:p>
+    <w:p>
+      <w:pPr>
+        <w:rPr>
+          <w:rFonts w:ascii="Arial" w:hAnsi="Arial"/>
+          <w:b/>
+          <w:sz w:val="22"/>
+          <w:u w:val="single"/>
+        </w:rPr>
+      </w:pPr>
+    </w:p>
+    <w:p>
+      <w:pPr>
+        <w:rPr>
+          <w:rFonts w:ascii="Arial" w:hAnsi="Arial"/>
+          <w:b/>
+          <w:sz w:val="22"/>
+          <w:u w:val="single"/>
+        </w:rPr>
+      </w:pPr>
+    </w:p>
+    <w:p>
+      <w:pPr>
+        <w:rPr>
+          <w:rFonts w:ascii="Arial" w:hAnsi="Arial"/>
+          <w:b/>
+          <w:sz w:val="22"/>
+          <w:u w:val="single"/>
+        </w:rPr>
+      </w:pPr>
+    </w:p>
+    <w:p>
+      <w:pPr>
+        <w:rPr>
+          <w:rFonts w:ascii="Arial" w:hAnsi="Arial"/>
+          <w:b/>
+          <w:sz w:val="22"/>
+          <w:u w:val="single"/>
+        </w:rPr>
+      </w:pPr>
+    </w:p>
+    <w:p>
+      <w:pPr>
+        <w:rPr>
+          <w:rFonts w:ascii="Arial" w:hAnsi="Arial"/>
+          <w:b/>
+          <w:sz w:val="22"/>
+          <w:u w:val="single"/>
+        </w:rPr>
+      </w:pPr>
+    </w:p>
+    <w:p>
+      <w:pPr>
+        <w:rPr>
+          <w:rFonts w:ascii="Arial" w:hAnsi="Arial"/>
+          <w:b/>
+          <w:sz w:val="22"/>
+          <w:u w:val="single"/>
+        </w:rPr>
+      </w:pPr>
+      <w:bookmarkStart w:id="0" w:name="_GoBack"/>
+      <w:bookmarkEnd w:id="0"/>
     </w:p>
     <w:p>
       <w:pPr>
@@ -1163,7 +1267,41 @@
           <w:sz w:val="22"/>
           <w:lang w:val="en-DE"/>
         </w:rPr>
-        <w:t>Creating 6 activity diagrams and 6 state diagrams according to the use case tables created a week before for each functional requirement.</w:t>
+        <w:t xml:space="preserve">Creating </w:t>
+      </w:r>
+      <w:r>
+        <w:rPr>
+          <w:rFonts w:ascii="Arial" w:hAnsi="Arial"/>
+          <w:sz w:val="22"/>
+          <w:lang w:val="en-DE"/>
+        </w:rPr>
+        <w:t xml:space="preserve">activity or </w:t>
+      </w:r>
+      <w:proofErr w:type="spellStart"/>
+      <w:r>
+        <w:rPr>
+          <w:rFonts w:ascii="Arial" w:hAnsi="Arial"/>
+          <w:sz w:val="22"/>
+          <w:lang w:val="en-DE"/>
+        </w:rPr>
+        <w:t>swimlane</w:t>
+      </w:r>
+      <w:proofErr w:type="spellEnd"/>
+      <w:r>
+        <w:rPr>
+          <w:rFonts w:ascii="Arial" w:hAnsi="Arial"/>
+          <w:sz w:val="22"/>
+          <w:lang w:val="en-DE"/>
+        </w:rPr>
+        <w:t xml:space="preserve"> diagrams</w:t>
+      </w:r>
+      <w:r>
+        <w:rPr>
+          <w:rFonts w:ascii="Arial" w:hAnsi="Arial"/>
+          <w:sz w:val="22"/>
+          <w:lang w:val="en-DE"/>
+        </w:rPr>
+        <w:t xml:space="preserve"> according to the use case tables created a week before for each functional requirement.</w:t>
       </w:r>
     </w:p>
     <w:p>
@@ -1237,6 +1375,14 @@
         </w:rPr>
         <w:t xml:space="preserve"> Functional Requirement no.1-no.6</w:t>
       </w:r>
+      <w:r>
+        <w:rPr>
+          <w:rFonts w:ascii="Arial" w:hAnsi="Arial"/>
+          <w:sz w:val="22"/>
+          <w:lang w:val="en-DE"/>
+        </w:rPr>
+        <w:t xml:space="preserve"> (FR1-FR6)</w:t>
+      </w:r>
     </w:p>
     <w:p>
       <w:pPr>
@@ -1264,67 +1410,53 @@
           <w:sz w:val="22"/>
           <w:lang w:val="en-DE"/>
         </w:rPr>
+        <w:t xml:space="preserve"> Toto –</w:t>
+      </w:r>
+      <w:r>
+        <w:rPr>
+          <w:rFonts w:ascii="Arial" w:hAnsi="Arial"/>
+          <w:sz w:val="22"/>
+          <w:lang w:val="en-DE"/>
+        </w:rPr>
+        <w:t xml:space="preserve"> Functional Requirement no.7-no.12</w:t>
+      </w:r>
+      <w:r>
+        <w:rPr>
+          <w:rFonts w:ascii="Arial" w:hAnsi="Arial"/>
+          <w:sz w:val="22"/>
+          <w:lang w:val="en-DE"/>
+        </w:rPr>
+        <w:t xml:space="preserve"> (FR7-FR12)</w:t>
+      </w:r>
+    </w:p>
+    <w:p>
+      <w:pPr>
+        <w:rPr>
+          <w:rFonts w:ascii="Arial" w:hAnsi="Arial"/>
+          <w:sz w:val="22"/>
+          <w:lang w:val="en-DE"/>
+        </w:rPr>
+      </w:pPr>
+      <w:proofErr w:type="spellStart"/>
+      <w:r>
+        <w:rPr>
+          <w:rFonts w:ascii="Arial" w:hAnsi="Arial"/>
+          <w:b/>
+          <w:sz w:val="22"/>
+          <w:lang w:val="en-DE"/>
+        </w:rPr>
+        <w:t>Ledio</w:t>
+      </w:r>
+      <w:proofErr w:type="spellEnd"/>
+      <w:r>
+        <w:rPr>
+          <w:rFonts w:ascii="Arial" w:hAnsi="Arial"/>
+          <w:b/>
+          <w:sz w:val="22"/>
+          <w:lang w:val="en-DE"/>
+        </w:rPr>
         <w:t xml:space="preserve"> </w:t>
       </w:r>
-      <w:r>
-        <w:rPr>
-          <w:rFonts w:ascii="Arial" w:hAnsi="Arial"/>
-          <w:b/>
-          <w:sz w:val="22"/>
-          <w:lang w:val="en-DE"/>
-        </w:rPr>
-        <w:t>Toto</w:t>
-      </w:r>
-      <w:r>
-        <w:rPr>
-          <w:rFonts w:ascii="Arial" w:hAnsi="Arial"/>
-          <w:b/>
-          <w:sz w:val="22"/>
-          <w:lang w:val="en-DE"/>
-        </w:rPr>
-        <w:t xml:space="preserve"> –</w:t>
-      </w:r>
-      <w:r>
-        <w:rPr>
-          <w:rFonts w:ascii="Arial" w:hAnsi="Arial"/>
-          <w:sz w:val="22"/>
-          <w:lang w:val="en-DE"/>
-        </w:rPr>
-        <w:t xml:space="preserve"> Functional Requirement no.</w:t>
-      </w:r>
-      <w:r>
-        <w:rPr>
-          <w:rFonts w:ascii="Arial" w:hAnsi="Arial"/>
-          <w:sz w:val="22"/>
-          <w:lang w:val="en-DE"/>
-        </w:rPr>
-        <w:t>7</w:t>
-      </w:r>
-      <w:r>
-        <w:rPr>
-          <w:rFonts w:ascii="Arial" w:hAnsi="Arial"/>
-          <w:sz w:val="22"/>
-          <w:lang w:val="en-DE"/>
-        </w:rPr>
-        <w:t>-no.</w:t>
-      </w:r>
-      <w:r>
-        <w:rPr>
-          <w:rFonts w:ascii="Arial" w:hAnsi="Arial"/>
-          <w:sz w:val="22"/>
-          <w:lang w:val="en-DE"/>
-        </w:rPr>
-        <w:t>12</w:t>
-      </w:r>
-    </w:p>
-    <w:p>
-      <w:pPr>
-        <w:rPr>
-          <w:rFonts w:ascii="Arial" w:hAnsi="Arial"/>
-          <w:sz w:val="22"/>
-          <w:lang w:val="en-DE"/>
-        </w:rPr>
-      </w:pPr>
       <w:proofErr w:type="spellStart"/>
       <w:r>
         <w:rPr>
@@ -1333,7 +1465,7 @@
           <w:sz w:val="22"/>
           <w:lang w:val="en-DE"/>
         </w:rPr>
-        <w:t>Ledio</w:t>
+        <w:t>Tafciu</w:t>
       </w:r>
       <w:proofErr w:type="spellEnd"/>
       <w:r>
@@ -1343,6 +1475,51 @@
           <w:sz w:val="22"/>
           <w:lang w:val="en-DE"/>
         </w:rPr>
+        <w:t xml:space="preserve"> – </w:t>
+      </w:r>
+      <w:r>
+        <w:rPr>
+          <w:rFonts w:ascii="Arial" w:hAnsi="Arial"/>
+          <w:sz w:val="22"/>
+          <w:lang w:val="en-DE"/>
+        </w:rPr>
+        <w:t>Functional Requirement no.13-no.18</w:t>
+      </w:r>
+      <w:r>
+        <w:rPr>
+          <w:rFonts w:ascii="Arial" w:hAnsi="Arial"/>
+          <w:sz w:val="22"/>
+          <w:lang w:val="en-DE"/>
+        </w:rPr>
+        <w:t xml:space="preserve"> (FR13-FR18)</w:t>
+      </w:r>
+    </w:p>
+    <w:p>
+      <w:pPr>
+        <w:rPr>
+          <w:rFonts w:ascii="Arial" w:hAnsi="Arial"/>
+          <w:sz w:val="22"/>
+          <w:lang w:val="en-DE"/>
+        </w:rPr>
+      </w:pPr>
+      <w:proofErr w:type="spellStart"/>
+      <w:r>
+        <w:rPr>
+          <w:rFonts w:ascii="Arial" w:hAnsi="Arial"/>
+          <w:b/>
+          <w:sz w:val="22"/>
+          <w:lang w:val="en-DE"/>
+        </w:rPr>
+        <w:t>Desard</w:t>
+      </w:r>
+      <w:proofErr w:type="spellEnd"/>
+      <w:r>
+        <w:rPr>
+          <w:rFonts w:ascii="Arial" w:hAnsi="Arial"/>
+          <w:b/>
+          <w:sz w:val="22"/>
+          <w:lang w:val="en-DE"/>
+        </w:rPr>
         <w:t xml:space="preserve"> </w:t>
       </w:r>
       <w:proofErr w:type="spellStart"/>
@@ -1353,7 +1530,7 @@
           <w:sz w:val="22"/>
           <w:lang w:val="en-DE"/>
         </w:rPr>
-        <w:t>Tafciu</w:t>
+        <w:t>Lybeshari</w:t>
       </w:r>
       <w:proofErr w:type="spellEnd"/>
       <w:r>
@@ -1371,31 +1548,49 @@
           <w:sz w:val="22"/>
           <w:lang w:val="en-DE"/>
         </w:rPr>
-        <w:t>Functional Requirement no.</w:t>
-      </w:r>
-      <w:r>
-        <w:rPr>
-          <w:rFonts w:ascii="Arial" w:hAnsi="Arial"/>
-          <w:sz w:val="22"/>
-          <w:lang w:val="en-DE"/>
-        </w:rPr>
-        <w:t>13</w:t>
-      </w:r>
-      <w:r>
-        <w:rPr>
-          <w:rFonts w:ascii="Arial" w:hAnsi="Arial"/>
-          <w:sz w:val="22"/>
-          <w:lang w:val="en-DE"/>
-        </w:rPr>
-        <w:t>-no.</w:t>
-      </w:r>
-      <w:r>
-        <w:rPr>
-          <w:rFonts w:ascii="Arial" w:hAnsi="Arial"/>
-          <w:sz w:val="22"/>
-          <w:lang w:val="en-DE"/>
-        </w:rPr>
-        <w:t>18</w:t>
+        <w:t>Functional Requirement no.19-no.24</w:t>
+      </w:r>
+      <w:r>
+        <w:rPr>
+          <w:rFonts w:ascii="Arial" w:hAnsi="Arial"/>
+          <w:sz w:val="22"/>
+          <w:lang w:val="en-DE"/>
+        </w:rPr>
+        <w:t xml:space="preserve"> (FR19-FR24)</w:t>
+      </w:r>
+    </w:p>
+    <w:p>
+      <w:pPr>
+        <w:rPr>
+          <w:rFonts w:ascii="Arial" w:hAnsi="Arial"/>
+          <w:sz w:val="22"/>
+          <w:lang w:val="en-DE"/>
+        </w:rPr>
+      </w:pPr>
+      <w:r>
+        <w:rPr>
+          <w:rFonts w:ascii="Arial" w:hAnsi="Arial"/>
+          <w:b/>
+          <w:sz w:val="22"/>
+          <w:lang w:val="en-DE"/>
+        </w:rPr>
+        <w:t xml:space="preserve">Matias Bali – </w:t>
+      </w:r>
+      <w:r>
+        <w:rPr>
+          <w:rFonts w:ascii="Arial" w:hAnsi="Arial"/>
+          <w:sz w:val="22"/>
+          <w:lang w:val="en-DE"/>
+        </w:rPr>
+        <w:t>Functional Requirement no.25-no.30</w:t>
+      </w:r>
+      <w:r>
+        <w:rPr>
+          <w:rFonts w:ascii="Arial" w:hAnsi="Arial"/>
+          <w:sz w:val="22"/>
+          <w:lang w:val="en-DE"/>
+        </w:rPr>
+        <w:t xml:space="preserve"> (FR25-FR30)</w:t>
       </w:r>
     </w:p>
     <w:p>
@@ -1414,7 +1609,7 @@
           <w:sz w:val="22"/>
           <w:lang w:val="en-DE"/>
         </w:rPr>
-        <w:t>Desard</w:t>
+        <w:t>Ornelt</w:t>
       </w:r>
       <w:proofErr w:type="spellEnd"/>
       <w:r>
@@ -1434,7 +1629,7 @@
           <w:sz w:val="22"/>
           <w:lang w:val="en-DE"/>
         </w:rPr>
-        <w:t>Lybeshari</w:t>
+        <w:t>Lemellari</w:t>
       </w:r>
       <w:proofErr w:type="spellEnd"/>
       <w:r>
@@ -1452,50 +1647,45 @@
           <w:sz w:val="22"/>
           <w:lang w:val="en-DE"/>
         </w:rPr>
-        <w:t>Functional Requirement no.</w:t>
-      </w:r>
-      <w:r>
-        <w:rPr>
-          <w:rFonts w:ascii="Arial" w:hAnsi="Arial"/>
-          <w:sz w:val="22"/>
-          <w:lang w:val="en-DE"/>
-        </w:rPr>
-        <w:t>19</w:t>
-      </w:r>
-      <w:r>
-        <w:rPr>
-          <w:rFonts w:ascii="Arial" w:hAnsi="Arial"/>
-          <w:sz w:val="22"/>
-          <w:lang w:val="en-DE"/>
-        </w:rPr>
-        <w:t>-no.</w:t>
-      </w:r>
-      <w:r>
-        <w:rPr>
-          <w:rFonts w:ascii="Arial" w:hAnsi="Arial"/>
-          <w:sz w:val="22"/>
-          <w:lang w:val="en-DE"/>
-        </w:rPr>
-        <w:t>24</w:t>
-      </w:r>
-    </w:p>
-    <w:p>
-      <w:pPr>
-        <w:rPr>
-          <w:rFonts w:ascii="Arial" w:hAnsi="Arial"/>
-          <w:sz w:val="22"/>
-          <w:lang w:val="en-DE"/>
-        </w:rPr>
-      </w:pPr>
-      <w:r>
-        <w:rPr>
-          <w:rFonts w:ascii="Arial" w:hAnsi="Arial"/>
-          <w:b/>
-          <w:sz w:val="22"/>
-          <w:lang w:val="en-DE"/>
-        </w:rPr>
-        <w:t>Matias Bali</w:t>
-      </w:r>
+        <w:t>Functional Requirement no.31-no.36</w:t>
+      </w:r>
+      <w:r>
+        <w:rPr>
+          <w:rFonts w:ascii="Arial" w:hAnsi="Arial"/>
+          <w:sz w:val="22"/>
+          <w:lang w:val="en-DE"/>
+        </w:rPr>
+        <w:t xml:space="preserve"> (FR31-FR36)</w:t>
+      </w:r>
+    </w:p>
+    <w:p>
+      <w:pPr>
+        <w:rPr>
+          <w:rFonts w:ascii="Arial" w:hAnsi="Arial"/>
+          <w:sz w:val="22"/>
+          <w:lang w:val="en-DE"/>
+        </w:rPr>
+      </w:pPr>
+      <w:r>
+        <w:rPr>
+          <w:rFonts w:ascii="Arial" w:hAnsi="Arial"/>
+          <w:b/>
+          <w:sz w:val="22"/>
+          <w:lang w:val="en-DE"/>
+        </w:rPr>
+        <w:t xml:space="preserve">Kevin </w:t>
+      </w:r>
+      <w:proofErr w:type="spellStart"/>
+      <w:r>
+        <w:rPr>
+          <w:rFonts w:ascii="Arial" w:hAnsi="Arial"/>
+          <w:b/>
+          <w:sz w:val="22"/>
+          <w:lang w:val="en-DE"/>
+        </w:rPr>
+        <w:t>Muho</w:t>
+      </w:r>
+      <w:proofErr w:type="spellEnd"/>
       <w:r>
         <w:rPr>
           <w:rFonts w:ascii="Arial" w:hAnsi="Arial"/>
@@ -1511,293 +1701,124 @@
           <w:sz w:val="22"/>
           <w:lang w:val="en-DE"/>
         </w:rPr>
-        <w:t>Functional Requirement no.</w:t>
-      </w:r>
-      <w:r>
-        <w:rPr>
-          <w:rFonts w:ascii="Arial" w:hAnsi="Arial"/>
-          <w:sz w:val="22"/>
-          <w:lang w:val="en-DE"/>
-        </w:rPr>
-        <w:t>25</w:t>
-      </w:r>
-      <w:r>
-        <w:rPr>
-          <w:rFonts w:ascii="Arial" w:hAnsi="Arial"/>
-          <w:sz w:val="22"/>
-          <w:lang w:val="en-DE"/>
-        </w:rPr>
-        <w:t>-no.</w:t>
-      </w:r>
-      <w:r>
-        <w:rPr>
-          <w:rFonts w:ascii="Arial" w:hAnsi="Arial"/>
-          <w:sz w:val="22"/>
-          <w:lang w:val="en-DE"/>
-        </w:rPr>
-        <w:t>30</w:t>
-      </w:r>
-    </w:p>
-    <w:p>
-      <w:pPr>
-        <w:rPr>
-          <w:rFonts w:ascii="Arial" w:hAnsi="Arial"/>
-          <w:sz w:val="22"/>
-          <w:lang w:val="en-DE"/>
-        </w:rPr>
-      </w:pPr>
+        <w:t>Functional Requirement no.37-no.42</w:t>
+      </w:r>
+      <w:r>
+        <w:rPr>
+          <w:rFonts w:ascii="Arial" w:hAnsi="Arial"/>
+          <w:sz w:val="22"/>
+          <w:lang w:val="en-DE"/>
+        </w:rPr>
+        <w:t xml:space="preserve"> (FR37-FR42)</w:t>
+      </w:r>
+    </w:p>
+    <w:p>
+      <w:pPr>
+        <w:rPr>
+          <w:rFonts w:ascii="Arial" w:hAnsi="Arial"/>
+          <w:b/>
+          <w:sz w:val="22"/>
+          <w:lang w:val="en-DE"/>
+        </w:rPr>
+      </w:pPr>
+    </w:p>
+    <w:p>
+      <w:pPr>
+        <w:rPr>
+          <w:rFonts w:ascii="Arial" w:hAnsi="Arial"/>
+          <w:b/>
+          <w:sz w:val="22"/>
+          <w:u w:val="single"/>
+          <w:lang w:val="en-DE"/>
+        </w:rPr>
+      </w:pPr>
+      <w:r>
+        <w:rPr>
+          <w:rFonts w:ascii="Arial" w:hAnsi="Arial"/>
+          <w:b/>
+          <w:sz w:val="22"/>
+          <w:u w:val="single"/>
+        </w:rPr>
+        <w:t>Time, Place, and Agenda for Next Meeting:</w:t>
+      </w:r>
+      <w:r>
+        <w:rPr>
+          <w:rFonts w:ascii="Arial" w:hAnsi="Arial"/>
+          <w:b/>
+          <w:sz w:val="22"/>
+          <w:u w:val="single"/>
+          <w:lang w:val="en-DE"/>
+        </w:rPr>
+        <w:t xml:space="preserve"> </w:t>
+      </w:r>
+    </w:p>
+    <w:p>
+      <w:pPr>
+        <w:rPr>
+          <w:rFonts w:ascii="Arial" w:hAnsi="Arial"/>
+          <w:sz w:val="22"/>
+          <w:lang w:val="en-DE"/>
+        </w:rPr>
+      </w:pPr>
+    </w:p>
+    <w:p>
+      <w:pPr>
+        <w:rPr>
+          <w:rFonts w:ascii="Arial" w:hAnsi="Arial"/>
+          <w:sz w:val="22"/>
+          <w:lang w:val="en-DE"/>
+        </w:rPr>
+      </w:pPr>
+      <w:r>
+        <w:rPr>
+          <w:rFonts w:ascii="Arial" w:hAnsi="Arial"/>
+          <w:sz w:val="22"/>
+          <w:lang w:val="en-DE"/>
+        </w:rPr>
+        <w:t>30/03/2026,</w:t>
+      </w:r>
+      <w:r>
+        <w:rPr>
+          <w:rFonts w:ascii="Arial" w:hAnsi="Arial"/>
+          <w:sz w:val="22"/>
+          <w:lang w:val="en-DE"/>
+        </w:rPr>
+        <w:t>1</w:t>
+      </w:r>
+      <w:r>
+        <w:rPr>
+          <w:rFonts w:ascii="Arial" w:hAnsi="Arial"/>
+          <w:sz w:val="22"/>
+          <w:lang w:val="en-DE"/>
+        </w:rPr>
+        <w:t>3</w:t>
+      </w:r>
+      <w:r>
+        <w:rPr>
+          <w:rFonts w:ascii="Arial" w:hAnsi="Arial"/>
+          <w:sz w:val="22"/>
+          <w:lang w:val="en-DE"/>
+        </w:rPr>
+        <w:t xml:space="preserve">:20, </w:t>
+      </w:r>
       <w:proofErr w:type="spellStart"/>
       <w:r>
         <w:rPr>
           <w:rFonts w:ascii="Arial" w:hAnsi="Arial"/>
-          <w:b/>
-          <w:sz w:val="22"/>
-          <w:lang w:val="en-DE"/>
-        </w:rPr>
-        <w:t>Ornelt</w:t>
+          <w:sz w:val="22"/>
+          <w:lang w:val="en-DE"/>
+        </w:rPr>
+        <w:t>Epoka</w:t>
       </w:r>
       <w:proofErr w:type="spellEnd"/>
       <w:r>
         <w:rPr>
           <w:rFonts w:ascii="Arial" w:hAnsi="Arial"/>
-          <w:b/>
           <w:sz w:val="22"/>
           <w:lang w:val="en-DE"/>
         </w:rPr>
         <w:t xml:space="preserve"> </w:t>
       </w:r>
-      <w:proofErr w:type="spellStart"/>
-      <w:r>
-        <w:rPr>
-          <w:rFonts w:ascii="Arial" w:hAnsi="Arial"/>
-          <w:b/>
-          <w:sz w:val="22"/>
-          <w:lang w:val="en-DE"/>
-        </w:rPr>
-        <w:t>Lemellari</w:t>
-      </w:r>
-      <w:proofErr w:type="spellEnd"/>
-      <w:r>
-        <w:rPr>
-          <w:rFonts w:ascii="Arial" w:hAnsi="Arial"/>
-          <w:b/>
-          <w:sz w:val="22"/>
-          <w:lang w:val="en-DE"/>
-        </w:rPr>
-        <w:t xml:space="preserve"> – </w:t>
-      </w:r>
-      <w:r>
-        <w:rPr>
-          <w:rFonts w:ascii="Arial" w:hAnsi="Arial"/>
-          <w:sz w:val="22"/>
-          <w:lang w:val="en-DE"/>
-        </w:rPr>
-        <w:t>Functional Requirement no.</w:t>
-      </w:r>
-      <w:r>
-        <w:rPr>
-          <w:rFonts w:ascii="Arial" w:hAnsi="Arial"/>
-          <w:sz w:val="22"/>
-          <w:lang w:val="en-DE"/>
-        </w:rPr>
-        <w:t>31</w:t>
-      </w:r>
-      <w:r>
-        <w:rPr>
-          <w:rFonts w:ascii="Arial" w:hAnsi="Arial"/>
-          <w:sz w:val="22"/>
-          <w:lang w:val="en-DE"/>
-        </w:rPr>
-        <w:t>-no.</w:t>
-      </w:r>
-      <w:r>
-        <w:rPr>
-          <w:rFonts w:ascii="Arial" w:hAnsi="Arial"/>
-          <w:sz w:val="22"/>
-          <w:lang w:val="en-DE"/>
-        </w:rPr>
-        <w:t>36</w:t>
-      </w:r>
-    </w:p>
-    <w:p>
-      <w:pPr>
-        <w:rPr>
-          <w:rFonts w:ascii="Arial" w:hAnsi="Arial"/>
-          <w:sz w:val="22"/>
-          <w:lang w:val="en-DE"/>
-        </w:rPr>
-      </w:pPr>
-      <w:r>
-        <w:rPr>
-          <w:rFonts w:ascii="Arial" w:hAnsi="Arial"/>
-          <w:b/>
-          <w:sz w:val="22"/>
-          <w:lang w:val="en-DE"/>
-        </w:rPr>
-        <w:t xml:space="preserve">Kevin </w:t>
-      </w:r>
-      <w:proofErr w:type="spellStart"/>
-      <w:r>
-        <w:rPr>
-          <w:rFonts w:ascii="Arial" w:hAnsi="Arial"/>
-          <w:b/>
-          <w:sz w:val="22"/>
-          <w:lang w:val="en-DE"/>
-        </w:rPr>
-        <w:t>Muho</w:t>
-      </w:r>
-      <w:proofErr w:type="spellEnd"/>
-      <w:r>
-        <w:rPr>
-          <w:rFonts w:ascii="Arial" w:hAnsi="Arial"/>
-          <w:b/>
-          <w:sz w:val="22"/>
-          <w:lang w:val="en-DE"/>
-        </w:rPr>
-        <w:t xml:space="preserve"> – </w:t>
-      </w:r>
-      <w:bookmarkStart w:id="0" w:name="_GoBack"/>
-      <w:bookmarkEnd w:id="0"/>
-      <w:r>
-        <w:rPr>
-          <w:rFonts w:ascii="Arial" w:hAnsi="Arial"/>
-          <w:sz w:val="22"/>
-          <w:lang w:val="en-DE"/>
-        </w:rPr>
-        <w:t>Functional Requirement no.</w:t>
-      </w:r>
-      <w:r>
-        <w:rPr>
-          <w:rFonts w:ascii="Arial" w:hAnsi="Arial"/>
-          <w:sz w:val="22"/>
-          <w:lang w:val="en-DE"/>
-        </w:rPr>
-        <w:t>37</w:t>
-      </w:r>
-      <w:r>
-        <w:rPr>
-          <w:rFonts w:ascii="Arial" w:hAnsi="Arial"/>
-          <w:sz w:val="22"/>
-          <w:lang w:val="en-DE"/>
-        </w:rPr>
-        <w:t>-no.</w:t>
-      </w:r>
-      <w:r>
-        <w:rPr>
-          <w:rFonts w:ascii="Arial" w:hAnsi="Arial"/>
-          <w:sz w:val="22"/>
-          <w:lang w:val="en-DE"/>
-        </w:rPr>
-        <w:t>42</w:t>
-      </w:r>
-    </w:p>
-    <w:p>
-      <w:pPr>
-        <w:rPr>
-          <w:rFonts w:ascii="Arial" w:hAnsi="Arial"/>
-          <w:b/>
-          <w:sz w:val="22"/>
-          <w:lang w:val="en-DE"/>
-        </w:rPr>
-      </w:pPr>
-    </w:p>
-    <w:p>
-      <w:pPr>
-        <w:rPr>
-          <w:rFonts w:ascii="Arial" w:hAnsi="Arial"/>
-          <w:b/>
-          <w:sz w:val="22"/>
-          <w:u w:val="single"/>
-          <w:lang w:val="en-DE"/>
-        </w:rPr>
-      </w:pPr>
-      <w:r>
-        <w:rPr>
-          <w:rFonts w:ascii="Arial" w:hAnsi="Arial"/>
-          <w:b/>
-          <w:sz w:val="22"/>
-          <w:u w:val="single"/>
-        </w:rPr>
-        <w:t>Time, Place, and Agenda for Next Meeting:</w:t>
-      </w:r>
-      <w:r>
-        <w:rPr>
-          <w:rFonts w:ascii="Arial" w:hAnsi="Arial"/>
-          <w:b/>
-          <w:sz w:val="22"/>
-          <w:u w:val="single"/>
-          <w:lang w:val="en-DE"/>
-        </w:rPr>
-        <w:t xml:space="preserve"> </w:t>
-      </w:r>
-    </w:p>
-    <w:p>
-      <w:pPr>
-        <w:rPr>
-          <w:rFonts w:ascii="Arial" w:hAnsi="Arial"/>
-          <w:sz w:val="22"/>
-          <w:lang w:val="en-DE"/>
-        </w:rPr>
-      </w:pPr>
-    </w:p>
-    <w:p>
-      <w:pPr>
-        <w:rPr>
-          <w:rFonts w:ascii="Arial" w:hAnsi="Arial"/>
-          <w:sz w:val="22"/>
-          <w:lang w:val="en-DE"/>
-        </w:rPr>
-      </w:pPr>
-      <w:r>
-        <w:rPr>
-          <w:rFonts w:ascii="Arial" w:hAnsi="Arial"/>
-          <w:sz w:val="22"/>
-          <w:lang w:val="en-DE"/>
-        </w:rPr>
-        <w:t>30/03/2026,</w:t>
-      </w:r>
-      <w:r>
-        <w:rPr>
-          <w:rFonts w:ascii="Arial" w:hAnsi="Arial"/>
-          <w:sz w:val="22"/>
-          <w:lang w:val="en-DE"/>
-        </w:rPr>
-        <w:t>1</w:t>
-      </w:r>
-      <w:r>
-        <w:rPr>
-          <w:rFonts w:ascii="Arial" w:hAnsi="Arial"/>
-          <w:sz w:val="22"/>
-          <w:lang w:val="en-DE"/>
-        </w:rPr>
-        <w:t>3</w:t>
-      </w:r>
-      <w:r>
-        <w:rPr>
-          <w:rFonts w:ascii="Arial" w:hAnsi="Arial"/>
-          <w:sz w:val="22"/>
-          <w:lang w:val="en-DE"/>
-        </w:rPr>
-        <w:t xml:space="preserve">:20, </w:t>
-      </w:r>
-      <w:proofErr w:type="spellStart"/>
-      <w:r>
-        <w:rPr>
-          <w:rFonts w:ascii="Arial" w:hAnsi="Arial"/>
-          <w:sz w:val="22"/>
-          <w:lang w:val="en-DE"/>
-        </w:rPr>
-        <w:t>Epoka</w:t>
-      </w:r>
-      <w:proofErr w:type="spellEnd"/>
-      <w:r>
-        <w:rPr>
-          <w:rFonts w:ascii="Arial" w:hAnsi="Arial"/>
-          <w:sz w:val="22"/>
-          <w:lang w:val="en-DE"/>
-        </w:rPr>
-        <w:t xml:space="preserve"> </w:t>
-      </w:r>
       <w:r>
         <w:rPr>
           <w:rFonts w:ascii="Arial" w:hAnsi="Arial"/>
@@ -1833,7 +1854,6 @@
           <w:lang w:val="en-DE"/>
         </w:rPr>
       </w:pPr>
-      <w:proofErr w:type="gramStart"/>
       <w:r>
         <w:rPr>
           <w:rFonts w:ascii="Arial" w:hAnsi="Arial"/>
@@ -1849,16 +1869,15 @@
           <w:sz w:val="22"/>
           <w:lang w:val="en-DE"/>
         </w:rPr>
-        <w:t>Assign</w:t>
-      </w:r>
-      <w:proofErr w:type="gramEnd"/>
-      <w:r>
-        <w:rPr>
-          <w:rFonts w:ascii="Arial" w:hAnsi="Arial"/>
-          <w:sz w:val="22"/>
-          <w:lang w:val="en-DE"/>
-        </w:rPr>
-        <w:t xml:space="preserve"> Tasks for next weeks project requirements</w:t>
+        <w:t>Assign Tasks for next weeks project requirements</w:t>
+      </w:r>
+      <w:r>
+        <w:rPr>
+          <w:rFonts w:ascii="Arial" w:hAnsi="Arial"/>
+          <w:sz w:val="22"/>
+          <w:lang w:val="en-DE"/>
+        </w:rPr>
+        <w:t>.</w:t>
       </w:r>
     </w:p>
     <w:p>
@@ -2065,7 +2084,7 @@
     <w:lsdException w:name="Closing" w:semiHidden="1" w:unhideWhenUsed="1"/>
     <w:lsdException w:name="Signature" w:semiHidden="1" w:unhideWhenUsed="1"/>
     <w:lsdException w:name="Default Paragraph Font" w:semiHidden="1" w:uiPriority="1" w:unhideWhenUsed="1"/>
-    <w:lsdException w:name="Body Text" w:semiHidden="1" w:unhideWhenUsed="1"/>
+    <w:lsdException w:name="Body Text" w:semiHidden="1" w:uiPriority="0" w:unhideWhenUsed="1"/>
     <w:lsdException w:name="Body Text Indent" w:semiHidden="1" w:unhideWhenUsed="1"/>
     <w:lsdException w:name="List Continue" w:semiHidden="1" w:unhideWhenUsed="1"/>
     <w:lsdException w:name="List Continue 2" w:semiHidden="1" w:unhideWhenUsed="1"/>

</xml_diff>